<commit_message>
feat: enable amendment sections B and C and prevent editor hangs
</commit_message>
<xml_diff>
--- a/assets/templates/word/business_amendment/Thong bao thay doi.docx
+++ b/assets/templates/word/business_amendment/Thong bao thay doi.docx
@@ -10060,8 +10060,9 @@
           <w:szCs w:val="25"/>
           <w:lang w:val="vi-VN"/>
           <w14:ligatures w14:val="none"/>
-        </w:rPr>
-        <w:t>………………………………………………………………………………………….</w:t>
+          <w:highlight w:val="yellow"/>
+        </w:rPr>
+        <w:t xml:space="preserve">………………………………………………………………………………………….</w:t>
       </w:r>
     </w:p>
     <w:p>
@@ -10084,8 +10085,9 @@
           <w:szCs w:val="25"/>
           <w:lang w:val="vi-VN"/>
           <w14:ligatures w14:val="none"/>
-        </w:rPr>
-        <w:t>………………………………………………………………………………………….</w:t>
+          <w:highlight w:val="yellow"/>
+        </w:rPr>
+        <w:t xml:space="preserve">………………………………………………………………………………………….</w:t>
       </w:r>
     </w:p>
     <w:p>
@@ -10108,8 +10110,9 @@
           <w:szCs w:val="25"/>
           <w:lang w:val="vi-VN"/>
           <w14:ligatures w14:val="none"/>
-        </w:rPr>
-        <w:t>………………………………………………………………………………………….</w:t>
+          <w:highlight w:val="yellow"/>
+        </w:rPr>
+        <w:t xml:space="preserve">………………………………………………………………………………………….</w:t>
       </w:r>
     </w:p>
     <w:p>
@@ -10162,7 +10165,42 @@
           <w:lang w:val="nl-NL"/>
           <w14:ligatures w14:val="none"/>
         </w:rPr>
-        <w:t>- Thông tin trên Giấy chứng nhận đăng ký doanh nghiệp/Giấy xác nhận về việc thay đổi nội dung đăng ký doanh nghiệp cấp ngày .../.../... là: …………………………………………</w:t>
+        <w:t xml:space="preserve">- Thông tin trên Giấy chứng nhận đăng ký doanh nghiệp/Giấy xác nhận về việc thay đổi nội dung đăng ký doanh nghiệp cấp ngày </w:t>
+      </w:r>
+      <w:r>
+        <w:rPr>
+          <w:rFonts w:ascii="Times New Roman" w:eastAsia="Times New Roman" w:hAnsi="Times New Roman" w:cs="Times New Roman"/>
+          <w:kern w:val="0"/>
+          <w:sz w:val="25"/>
+          <w:szCs w:val="25"/>
+          <w:lang w:val="nl-NL"/>
+          <w14:ligatures w14:val="none"/>
+          <w:highlight w:val="yellow"/>
+        </w:rPr>
+        <w:t xml:space="preserve">.../.../...</w:t>
+      </w:r>
+      <w:r>
+        <w:rPr>
+          <w:rFonts w:ascii="Times New Roman" w:eastAsia="Times New Roman" w:hAnsi="Times New Roman" w:cs="Times New Roman"/>
+          <w:kern w:val="0"/>
+          <w:sz w:val="25"/>
+          <w:szCs w:val="25"/>
+          <w:lang w:val="nl-NL"/>
+          <w14:ligatures w14:val="none"/>
+        </w:rPr>
+        <w:t xml:space="preserve"> là: </w:t>
+      </w:r>
+      <w:r>
+        <w:rPr>
+          <w:rFonts w:ascii="Times New Roman" w:eastAsia="Times New Roman" w:hAnsi="Times New Roman" w:cs="Times New Roman"/>
+          <w:kern w:val="0"/>
+          <w:sz w:val="25"/>
+          <w:szCs w:val="25"/>
+          <w:lang w:val="nl-NL"/>
+          <w14:ligatures w14:val="none"/>
+          <w:highlight w:val="yellow"/>
+        </w:rPr>
+        <w:t xml:space="preserve">…………………………………………</w:t>
       </w:r>
     </w:p>
     <w:p>
@@ -10186,8 +10224,9 @@
           <w:szCs w:val="25"/>
           <w:lang w:val="nl-NL"/>
           <w14:ligatures w14:val="none"/>
-        </w:rPr>
-        <w:t>………………………………………………………………………………………….</w:t>
+          <w:highlight w:val="yellow"/>
+        </w:rPr>
+        <w:t xml:space="preserve">………………………………………………………………………………………….</w:t>
       </w:r>
     </w:p>
     <w:p>
@@ -10235,7 +10274,30 @@
           <w:lang w:val="nl-NL"/>
           <w14:ligatures w14:val="none"/>
         </w:rPr>
-        <w:t xml:space="preserve"> nộp ngày .../.../... </w:t>
+        <w:t xml:space="preserve"> nộp ngày </w:t>
+      </w:r>
+      <w:r>
+        <w:rPr>
+          <w:rFonts w:ascii="Times New Roman" w:eastAsia="Times New Roman" w:hAnsi="Times New Roman" w:cs="Times New Roman"/>
+          <w:kern w:val="0"/>
+          <w:sz w:val="25"/>
+          <w:szCs w:val="25"/>
+          <w:lang w:val="nl-NL"/>
+          <w14:ligatures w14:val="none"/>
+          <w:highlight w:val="yellow"/>
+        </w:rPr>
+        <w:t xml:space="preserve">.../.../...</w:t>
+      </w:r>
+      <w:r>
+        <w:rPr>
+          <w:rFonts w:ascii="Times New Roman" w:eastAsia="Times New Roman" w:hAnsi="Times New Roman" w:cs="Times New Roman"/>
+          <w:kern w:val="0"/>
+          <w:sz w:val="25"/>
+          <w:szCs w:val="25"/>
+          <w:lang w:val="nl-NL"/>
+          <w14:ligatures w14:val="none"/>
+        </w:rPr>
+        <w:t xml:space="preserve"> </w:t>
       </w:r>
     </w:p>
     <w:p>
@@ -10260,7 +10322,19 @@
           <w:lang w:val="nl-NL"/>
           <w14:ligatures w14:val="none"/>
         </w:rPr>
-        <w:t>là:......................................................................................................................</w:t>
+        <w:t xml:space="preserve">là:</w:t>
+      </w:r>
+      <w:r>
+        <w:rPr>
+          <w:rFonts w:ascii="Times New Roman" w:eastAsia="Times New Roman" w:hAnsi="Times New Roman" w:cs="Times New Roman"/>
+          <w:kern w:val="0"/>
+          <w:sz w:val="25"/>
+          <w:szCs w:val="25"/>
+          <w:lang w:val="nl-NL"/>
+          <w14:ligatures w14:val="none"/>
+          <w:highlight w:val="yellow"/>
+        </w:rPr>
+        <w:t xml:space="preserve">......................................................................................................................</w:t>
       </w:r>
     </w:p>
     <w:p>
@@ -10284,8 +10358,9 @@
           <w:szCs w:val="25"/>
           <w:lang w:val="nl-NL"/>
           <w14:ligatures w14:val="none"/>
-        </w:rPr>
-        <w:t>………………………………………………………………………………………….</w:t>
+          <w:highlight w:val="yellow"/>
+        </w:rPr>
+        <w:t xml:space="preserve">………………………………………………………………………………………….</w:t>
       </w:r>
     </w:p>
     <w:p>

</xml_diff>